<commit_message>
Публикация прототипа из Flumos1/MLO@74e656f92effd843ec6c5dc04587d561e7a63823
</commit_message>
<xml_diff>
--- a/docs/06_Pilot_40_countries_EN.docx
+++ b/docs/06_Pilot_40_countries_EN.docx
@@ -72,7 +72,7 @@
           <w:sz w:val="22"/>
           <w:szCs w:val="22"/>
         </w:rPr>
-        <w:t xml:space="preserve">MPI-LO methodology 0.1 (pilot, October 2026); data snapshot hash 1f5042c4967f9883</w:t>
+        <w:t xml:space="preserve">MPI-LO methodology 0.1 (pilot, October 2026); data snapshot hash 9e0c5c34c697ec23</w:t>
       </w:r>
     </w:p>
     <w:p>
@@ -907,7 +907,7 @@
         <w:t xml:space="preserve">Data.</w:t>
       </w:r>
       <w:r>
-        <w:t xml:space="preserve"> Values were collected automatically for 83.9% of “country × indicator” cells (8,492 of 10,120): open statistics are 91% filled, the IISS block — 67%, OSINT indicators — 69%, expert ones — 99% (a template has been prepared for them).</w:t>
+        <w:t xml:space="preserve"> Values were collected automatically for 83.9% of “country × indicator” cells (8,494 of 10,120): open statistics are 91% filled, the IISS block — 67%, OSINT indicators — 69%, expert ones — 99% (a template has been prepared for them).</w:t>
       </w:r>
     </w:p>
     <w:p>
@@ -4134,7 +4134,7 @@
                 <w:sz w:val="18"/>
                 <w:szCs w:val="18"/>
               </w:rPr>
-              <w:t xml:space="preserve">3068</w:t>
+              <w:t xml:space="preserve">3070</w:t>
             </w:r>
           </w:p>
         </w:tc>
@@ -4402,7 +4402,7 @@
         <w:jc w:val="both"/>
       </w:pPr>
       <w:r>
-        <w:t xml:space="preserve">Of the 253 indicators, 22 have no data for any country: these are expert scores, production and operational OSINT indicators (shell and drone output, flying hours, days at sea) and part of the IISS indicators that are absent from open tables (special operations forces, SAM battalions, vertical launch system cells, average age of fleets). A manual entry template for 1,270 cells has been created for them. Quality indicators (role Q) are filled to 88%.</w:t>
+        <w:t xml:space="preserve">Of the 253 indicators, 22 have no data for any country: these are expert scores, production and operational OSINT indicators (shell and drone output, flying hours, days at sea) and part of the IISS indicators that are absent from open tables (special operations forces, SAM battalions, vertical launch system cells, average age of fleets). A manual entry template for 1,268 cells has been created for them. Quality indicators (role Q) are filled to 88%.</w:t>
       </w:r>
     </w:p>
     <w:p>
@@ -10621,7 +10621,7 @@
                 <w:sz w:val="16"/>
                 <w:szCs w:val="16"/>
               </w:rPr>
-              <w:t xml:space="preserve">32</w:t>
+              <w:t xml:space="preserve">34</w:t>
             </w:r>
           </w:p>
         </w:tc>
@@ -20694,7 +20694,7 @@
                 <w:sz w:val="16"/>
                 <w:szCs w:val="16"/>
               </w:rPr>
-              <w:t xml:space="preserve">45.3</w:t>
+              <w:t xml:space="preserve">45.5</w:t>
             </w:r>
           </w:p>
         </w:tc>
@@ -20729,7 +20729,7 @@
                 <w:sz w:val="16"/>
                 <w:szCs w:val="16"/>
               </w:rPr>
-              <w:t xml:space="preserve">43.5–47.4</w:t>
+              <w:t xml:space="preserve">43.6–47.5</w:t>
             </w:r>
           </w:p>
         </w:tc>
@@ -20799,7 +20799,7 @@
                 <w:sz w:val="16"/>
                 <w:szCs w:val="16"/>
               </w:rPr>
-              <w:t xml:space="preserve">45.2</w:t>
+              <w:t xml:space="preserve">45.4</w:t>
             </w:r>
           </w:p>
         </w:tc>
@@ -27635,7 +27635,7 @@
                 <w:sz w:val="16"/>
                 <w:szCs w:val="16"/>
               </w:rPr>
-              <w:t xml:space="preserve">11.7</w:t>
+              <w:t xml:space="preserve">11.9</w:t>
             </w:r>
           </w:p>
         </w:tc>
@@ -27670,7 +27670,7 @@
                 <w:sz w:val="16"/>
                 <w:szCs w:val="16"/>
               </w:rPr>
-              <w:t xml:space="preserve">11.8–15.8</w:t>
+              <w:t xml:space="preserve">11.9–16.1</w:t>
             </w:r>
           </w:p>
         </w:tc>
@@ -27740,7 +27740,7 @@
                 <w:sz w:val="16"/>
                 <w:szCs w:val="16"/>
               </w:rPr>
-              <w:t xml:space="preserve">12.5</w:t>
+              <w:t xml:space="preserve">12.7</w:t>
             </w:r>
           </w:p>
         </w:tc>
@@ -50210,7 +50210,7 @@
         <w:t xml:space="preserve">Expert indicators without an objective measurer</w:t>
       </w:r>
       <w:r>
-        <w:t xml:space="preserve"> (67, a template for 1,270 cells): training, serviceability, flying hours, quality of command, munitions production. They are to be filled — by an expert panel under the Delphi procedure with explicit uncertainty; without them the pilot does not pass validation on the war between Russia and Ukraine.</w:t>
+        <w:t xml:space="preserve"> (67, a template for 1,268 cells): training, serviceability, flying hours, quality of command, munitions production. They are to be filled — by an expert panel under the Delphi procedure with explicit uncertainty; without them the pilot does not pass validation on the war between Russia and Ukraine.</w:t>
       </w:r>
     </w:p>
     <w:p>

</xml_diff>

<commit_message>
Публикация прототипа из Flumos1/MLO@37fb392b18f4a4976d03f2c6e5e25a1f7e444b38
</commit_message>
<xml_diff>
--- a/docs/06_Pilot_40_countries_EN.docx
+++ b/docs/06_Pilot_40_countries_EN.docx
@@ -72,7 +72,7 @@
           <w:sz w:val="22"/>
           <w:szCs w:val="22"/>
         </w:rPr>
-        <w:t xml:space="preserve">MPI-LO methodology 0.1 (pilot, October 2026); data snapshot hash 9e0c5c34c697ec23</w:t>
+        <w:t xml:space="preserve">MPI-LO methodology 0.1 (pilot, October 2026); data snapshot hash 9e84e3a6deffc44f</w:t>
       </w:r>
     </w:p>
     <w:p>
@@ -907,7 +907,7 @@
         <w:t xml:space="preserve">Data.</w:t>
       </w:r>
       <w:r>
-        <w:t xml:space="preserve"> Values were collected automatically for 83.9% of “country × indicator” cells (8,494 of 10,120): open statistics are 91% filled, the IISS block — 67%, OSINT indicators — 69%, expert ones — 99% (a template has been prepared for them).</w:t>
+        <w:t xml:space="preserve"> Values were collected automatically for 84.0% of “country × indicator” cells (8,499 of 10,120): open statistics are 91% filled, the IISS block — 67%, OSINT indicators — 69%, expert ones — 99% (a template has been prepared for them).</w:t>
       </w:r>
     </w:p>
     <w:p>
@@ -987,7 +987,7 @@
         <w:t xml:space="preserve">Rating.</w:t>
       </w:r>
       <w:r>
-        <w:t xml:space="preserve"> United States 79.7, China 75.6, Russia 70.5; then a tight group of seven countries from 50 to 55 points, whose places are statistically indistinguishable.</w:t>
+        <w:t xml:space="preserve"> United States 79.7, China 75.7, Russia 70.4; then a tight group of seven countries from 50 to 55 points, whose places are statistically indistinguishable.</w:t>
       </w:r>
     </w:p>
     <w:p>
@@ -1007,7 +1007,7 @@
         <w:t xml:space="preserve">Expert indicators — replaced by objective measurers.</w:t>
       </w:r>
       <w:r>
-        <w:t xml:space="preserve"> Expert scores have been replaced by measurable quantities from open databases where these reflect the same phenomenon (13 indicators: willingness to fight and trust in the army from WVS, combat experience from UCDP, the share of domestically produced weapons and equipment, strategic depth from GIS, etc.). 67 expert indicators have no objective measurer: until the expert panel is conducted (document 7) they are temporarily filled with an AI expert assessment — class D, with intervals, the lowest source priority (section 1.6).</w:t>
+        <w:t xml:space="preserve"> Expert scores have been replaced by measurable quantities from open databases where these reflect the same phenomenon (13 indicators: willingness to fight and trust in the army from WVS, combat experience from UCDP, the share of domestically produced weapons and equipment, strategic depth from GIS, etc.). 64 expert indicators have no objective measurer: until the expert panel is conducted (document 7) they are temporarily filled with an AI expert assessment — class D, with intervals, the lowest source priority (section 1.6).</w:t>
       </w:r>
     </w:p>
     <w:p>
@@ -3917,7 +3917,7 @@
                 <w:sz w:val="18"/>
                 <w:szCs w:val="18"/>
               </w:rPr>
-              <w:t xml:space="preserve">1427</w:t>
+              <w:t xml:space="preserve">1428</w:t>
             </w:r>
           </w:p>
         </w:tc>
@@ -4026,7 +4026,7 @@
                 <w:sz w:val="18"/>
                 <w:szCs w:val="18"/>
               </w:rPr>
-              <w:t xml:space="preserve">1186</w:t>
+              <w:t xml:space="preserve">1207</w:t>
             </w:r>
           </w:p>
         </w:tc>
@@ -4134,7 +4134,7 @@
                 <w:sz w:val="18"/>
                 <w:szCs w:val="18"/>
               </w:rPr>
-              <w:t xml:space="preserve">3070</w:t>
+              <w:t xml:space="preserve">3111</w:t>
             </w:r>
           </w:p>
         </w:tc>
@@ -4168,7 +4168,7 @@
                 <w:sz w:val="18"/>
                 <w:szCs w:val="18"/>
               </w:rPr>
-              <w:t xml:space="preserve">36%</w:t>
+              <w:t xml:space="preserve">37%</w:t>
             </w:r>
           </w:p>
         </w:tc>
@@ -4243,7 +4243,7 @@
                 <w:sz w:val="18"/>
                 <w:szCs w:val="18"/>
               </w:rPr>
-              <w:t xml:space="preserve">2772</w:t>
+              <w:t xml:space="preserve">2714</w:t>
             </w:r>
           </w:p>
         </w:tc>
@@ -4278,7 +4278,7 @@
                 <w:sz w:val="18"/>
                 <w:szCs w:val="18"/>
               </w:rPr>
-              <w:t xml:space="preserve">33%</w:t>
+              <w:t xml:space="preserve">32%</w:t>
             </w:r>
           </w:p>
         </w:tc>
@@ -9177,7 +9177,7 @@
                 <w:sz w:val="16"/>
                 <w:szCs w:val="16"/>
               </w:rPr>
-              <w:t xml:space="preserve">Sweden</w:t>
+              <w:t xml:space="preserve">Taiwan</w:t>
             </w:r>
           </w:p>
         </w:tc>
@@ -9212,7 +9212,7 @@
                 <w:sz w:val="16"/>
                 <w:szCs w:val="16"/>
               </w:rPr>
-              <w:t xml:space="preserve">100%</w:t>
+              <w:t xml:space="preserve">11%</w:t>
             </w:r>
           </w:p>
         </w:tc>
@@ -9247,7 +9247,7 @@
                 <w:sz w:val="16"/>
                 <w:szCs w:val="16"/>
               </w:rPr>
-              <w:t xml:space="preserve">90%</w:t>
+              <w:t xml:space="preserve">15%</w:t>
             </w:r>
           </w:p>
         </w:tc>
@@ -9282,7 +9282,7 @@
                 <w:sz w:val="16"/>
                 <w:szCs w:val="16"/>
               </w:rPr>
-              <w:t xml:space="preserve">28</w:t>
+              <w:t xml:space="preserve">47</w:t>
             </w:r>
           </w:p>
         </w:tc>
@@ -9352,7 +9352,7 @@
                 <w:sz w:val="16"/>
                 <w:szCs w:val="16"/>
               </w:rPr>
-              <w:t xml:space="preserve">—</w:t>
+              <w:t xml:space="preserve">11</w:t>
             </w:r>
           </w:p>
         </w:tc>
@@ -9387,7 +9387,7 @@
                 <w:sz w:val="16"/>
                 <w:szCs w:val="16"/>
               </w:rPr>
-              <w:t xml:space="preserve">4</w:t>
+              <w:t xml:space="preserve">22</w:t>
             </w:r>
           </w:p>
         </w:tc>
@@ -12354,7 +12354,7 @@
         <w:jc w:val="both"/>
       </w:pPr>
       <w:r>
-        <w:t xml:space="preserve">67 expert indicators have no objective measurer. These are training and readiness (flying hours, days at sea, serviceability, manning), the quality of command, doctrine and governance, network-centric warfare and EW, munitions and drone production, missile and shell stockpiles, mobilisation readiness, ally reliability. They can only be filled with closed data or an expert panel with a reconciliation procedure (for example, the Delphi method with spread estimation).</w:t>
+        <w:t xml:space="preserve">64 expert indicators have no objective measurer. These are training and readiness (flying hours, days at sea, serviceability, manning), the quality of command, doctrine and governance, network-centric warfare and EW, munitions and drone production, missile and shell stockpiles, mobilisation readiness, ally reliability. They can only be filled with closed data or an expert panel with a reconciliation procedure (for example, the Delphi method with spread estimation).</w:t>
       </w:r>
     </w:p>
     <w:p>
@@ -12367,7 +12367,7 @@
           <w:sz w:val="18"/>
           <w:szCs w:val="18"/>
         </w:rPr>
-        <w:t xml:space="preserve">Without a measurer: G07 Tanks with active protection systems (APS); G14 Counter-battery radars and artillery reconnaissance; G18 Counter-UAV means (EW, close-in weapon systems); G22 Loitering munitions and FPV drones (annual output); G26 Tactical electronic warfare systems; G28 Personnel manning of units; G29 Equipment serviceability rate; G30 Field training intensity (exercise days per year); G31 Thermal imagers and night sights; G32 Artillery ammunition stocks; A13 Long-range loitering munitions (annual output); A14 Long-range air-to-air missiles (class); A15 Air-launched cruise missile stocks; A16 Precision-guided bombs and guided bomb units; A17 Average annual pilot flying hours; A18 Aircraft fleet serviceability; A21 Hardened aircraft shelters; A25 Surface-to-air missile stocks; A27 Territory coverage by an integrated air-defence system; N08 Naval area air defence; N09 Anti-ship missiles (range, speed); N24 Days at sea per ship per year; N25 Operational availability rate of ships; S05 Latent nuclear potential (enrichment, reprocessing); S11 Assured retaliation (force survivability); S14 Extended deterrence (allied “nuclear umbrella”); S16 Long-range land- and sea-based cruise missiles; S18 Non-nuclear precision weapons with range from 1,500 km; C08 Cyber command (existence, personnel); C10 Offensive cyber capability; C11 Military use of AI (programmes, adoption); C12 Quantum technologies and cryptography; C13 Integrated automated command system (network-centricity); C14 Secure military communications at all levels; C17 Strategic electronic warfare systems; C18 Radar coverage of airspace; C19 Scale of military intelligence (resource estimate); P05 Share of contract personnel; P08 Personnel retention (share renewing contracts); P11 Share of professional NCOs; P16 Desertion and draft evasion; P19 Foreign instructors and training abroad; E05 Share of procurement and R&amp;D in the defence budget; E06 Military R&amp;D; E21 Sanctions resilience and access to financial markets; I06 Armoured vehicle output per year; I07 Artillery shell output per year; I08 Combat aircraft output per year; I09 Missile output (cruise, ballistic, SAM) per year; I10 UAV output per year; I12 Industrial mobilisation readiness; I17 Microelectronics: domestic chip production; I18 Domestic aero-engine industry; I24 Propellant and explosive production capacity; L07 Military transport rolling stock (carriers, tractors); L17 Mobilisation reserve deployment time; L19 Mobilisation stocks of materiel; L21 Power grid resilience (redundancy, protection); L22 Civil defence and protective structures; D07 Neighbours with territorial disputes; X04 Reliability of allied commitments; X11 Intelligence sharing with allies; H03 Battle casualty replacement rate; H07 Quality of military doctrine and its fit to modern war; H08 Quality of senior command; H09 Decision speed and delegation of authority; H13 Resilience to adversary information operations.</w:t>
+        <w:t xml:space="preserve">Without a measurer: G07 Tanks with active protection systems (APS); G14 Counter-battery radars and artillery reconnaissance; G18 Counter-UAV means (EW, close-in weapon systems); G22 Loitering munitions and FPV drones (annual output); G26 Tactical electronic warfare systems; G28 Personnel manning of units; G29 Equipment serviceability rate; G30 Field training intensity (exercise days per year); G31 Thermal imagers and night sights; G32 Artillery ammunition stocks; A13 Long-range loitering munitions (annual output); A14 Long-range air-to-air missiles (class); A15 Air-launched cruise missile stocks; A16 Precision-guided bombs and guided bomb units; A17 Average annual pilot flying hours; A18 Aircraft fleet serviceability; A21 Hardened aircraft shelters; A25 Surface-to-air missile stocks; A27 Territory coverage by an integrated air-defence system; N08 Naval area air defence; N09 Anti-ship missiles (range, speed); N24 Days at sea per ship per year; N25 Operational availability rate of ships; S05 Latent nuclear potential (enrichment, reprocessing); S11 Assured retaliation (force survivability); S14 Extended deterrence (allied “nuclear umbrella”); S16 Long-range land- and sea-based cruise missiles; S18 Non-nuclear precision weapons with range from 1,500 km; C08 Cyber command (existence, personnel); C10 Offensive cyber capability; C11 Military use of AI (programmes, adoption); C12 Quantum technologies and cryptography; C13 Integrated automated command system (network-centricity); C14 Secure military communications at all levels; C17 Strategic electronic warfare systems; C18 Radar coverage of airspace; C19 Scale of military intelligence (resource estimate); P05 Share of contract personnel; P08 Personnel retention (share renewing contracts); P11 Share of professional NCOs; P16 Desertion and draft evasion; P19 Foreign instructors and training abroad; I06 Armoured vehicle output per year; I07 Artillery shell output per year; I08 Combat aircraft output per year; I09 Missile output (cruise, ballistic, SAM) per year; I10 UAV output per year; I12 Industrial mobilisation readiness; I17 Microelectronics: domestic chip production; I18 Domestic aero-engine industry; I24 Propellant and explosive production capacity; L07 Military transport rolling stock (carriers, tractors); L17 Mobilisation reserve deployment time; L19 Mobilisation stocks of materiel; L21 Power grid resilience (redundancy, protection); L22 Civil defence and protective structures; D07 Neighbours with territorial disputes; X04 Reliability of allied commitments; X11 Intelligence sharing with allies; H03 Battle casualty replacement rate; H07 Quality of military doctrine and its fit to modern war; H08 Quality of senior command; H09 Decision speed and delegation of authority; H13 Resilience to adversary information operations.</w:t>
       </w:r>
     </w:p>
     <w:p>
@@ -12428,7 +12428,7 @@
         <w:jc w:val="both"/>
       </w:pPr>
       <w:r>
-        <w:t xml:space="preserve">By the user's decision, indicators without an objective measurer were filled with an AI expert assessment (model Claude Opus 5.5) from open sources up to mid-2026: 67 indicators × 40 countries (2,680 cells), a point estimate and an 80% interval, with a rationale for each indicator — data/delphi/ai/ai</w:t>
+        <w:t xml:space="preserve">By the user's decision, indicators without an objective measurer were filled with an AI expert assessment (model Claude Opus 5.5) from open sources up to mid-2026: 64 indicators × 40 countries (2,622 cells), a point estimate and an 80% interval, with a rationale for each indicator — data/delphi/ai/ai</w:t>
       </w:r>
       <w:r>
         <w:rPr>
@@ -12786,7 +12786,7 @@
                 <w:sz w:val="18"/>
                 <w:szCs w:val="18"/>
               </w:rPr>
-              <w:t xml:space="preserve">80.2</w:t>
+              <w:t xml:space="preserve">80.3</w:t>
             </w:r>
           </w:p>
         </w:tc>
@@ -12930,7 +12930,7 @@
                 <w:sz w:val="18"/>
                 <w:szCs w:val="18"/>
               </w:rPr>
-              <w:t xml:space="preserve">56.3</w:t>
+              <w:t xml:space="preserve">56.5</w:t>
             </w:r>
           </w:p>
         </w:tc>
@@ -12965,7 +12965,7 @@
                 <w:sz w:val="18"/>
                 <w:szCs w:val="18"/>
               </w:rPr>
-              <w:t xml:space="preserve">59.1</w:t>
+              <w:t xml:space="preserve">59.0</w:t>
             </w:r>
           </w:p>
         </w:tc>
@@ -13072,7 +13072,7 @@
                 <w:sz w:val="18"/>
                 <w:szCs w:val="18"/>
               </w:rPr>
-              <w:t xml:space="preserve">44.8</w:t>
+              <w:t xml:space="preserve">45.0</w:t>
             </w:r>
           </w:p>
         </w:tc>
@@ -13106,7 +13106,7 @@
                 <w:sz w:val="18"/>
                 <w:szCs w:val="18"/>
               </w:rPr>
-              <w:t xml:space="preserve">52.2</w:t>
+              <w:t xml:space="preserve">52.4</w:t>
             </w:r>
           </w:p>
         </w:tc>
@@ -13216,7 +13216,7 @@
                 <w:sz w:val="18"/>
                 <w:szCs w:val="18"/>
               </w:rPr>
-              <w:t xml:space="preserve">71.0</w:t>
+              <w:t xml:space="preserve">70.7</w:t>
             </w:r>
           </w:p>
         </w:tc>
@@ -13251,7 +13251,7 @@
                 <w:sz w:val="18"/>
                 <w:szCs w:val="18"/>
               </w:rPr>
-              <w:t xml:space="preserve">70.5</w:t>
+              <w:t xml:space="preserve">70.4</w:t>
             </w:r>
           </w:p>
         </w:tc>
@@ -13358,7 +13358,7 @@
                 <w:sz w:val="18"/>
                 <w:szCs w:val="18"/>
               </w:rPr>
-              <w:t xml:space="preserve">51.7</w:t>
+              <w:t xml:space="preserve">51.9</w:t>
             </w:r>
           </w:p>
         </w:tc>
@@ -13502,7 +13502,7 @@
                 <w:sz w:val="18"/>
                 <w:szCs w:val="18"/>
               </w:rPr>
-              <w:t xml:space="preserve">51.9</w:t>
+              <w:t xml:space="preserve">52.1</w:t>
             </w:r>
           </w:p>
         </w:tc>
@@ -13537,7 +13537,7 @@
                 <w:sz w:val="18"/>
                 <w:szCs w:val="18"/>
               </w:rPr>
-              <w:t xml:space="preserve">54.9</w:t>
+              <w:t xml:space="preserve">55.0</w:t>
             </w:r>
           </w:p>
         </w:tc>
@@ -13644,7 +13644,7 @@
                 <w:sz w:val="18"/>
                 <w:szCs w:val="18"/>
               </w:rPr>
-              <w:t xml:space="preserve">35.8</w:t>
+              <w:t xml:space="preserve">35.7</w:t>
             </w:r>
           </w:p>
         </w:tc>
@@ -13678,7 +13678,7 @@
                 <w:sz w:val="18"/>
                 <w:szCs w:val="18"/>
               </w:rPr>
-              <w:t xml:space="preserve">45.3</w:t>
+              <w:t xml:space="preserve">45.2</w:t>
             </w:r>
           </w:p>
         </w:tc>
@@ -15646,7 +15646,7 @@
                 <w:sz w:val="16"/>
                 <w:szCs w:val="16"/>
               </w:rPr>
-              <w:t xml:space="preserve">75.6</w:t>
+              <w:t xml:space="preserve">75.7</w:t>
             </w:r>
           </w:p>
         </w:tc>
@@ -15681,7 +15681,7 @@
                 <w:sz w:val="16"/>
                 <w:szCs w:val="16"/>
               </w:rPr>
-              <w:t xml:space="preserve">73.4–76.6</w:t>
+              <w:t xml:space="preserve">73.5–76.8</w:t>
             </w:r>
           </w:p>
         </w:tc>
@@ -15751,7 +15751,7 @@
                 <w:sz w:val="16"/>
                 <w:szCs w:val="16"/>
               </w:rPr>
-              <w:t xml:space="preserve">77.3</w:t>
+              <w:t xml:space="preserve">77.5</w:t>
             </w:r>
           </w:p>
         </w:tc>
@@ -15963,7 +15963,7 @@
                 <w:sz w:val="16"/>
                 <w:szCs w:val="16"/>
               </w:rPr>
-              <w:t xml:space="preserve">70.5</w:t>
+              <w:t xml:space="preserve">70.4</w:t>
             </w:r>
           </w:p>
         </w:tc>
@@ -15997,7 +15997,7 @@
                 <w:sz w:val="16"/>
                 <w:szCs w:val="16"/>
               </w:rPr>
-              <w:t xml:space="preserve">68.6–71.7</w:t>
+              <w:t xml:space="preserve">68.6–71.6</w:t>
             </w:r>
           </w:p>
         </w:tc>
@@ -16277,7 +16277,7 @@
                 <w:sz w:val="16"/>
                 <w:szCs w:val="16"/>
               </w:rPr>
-              <w:t xml:space="preserve">59.1</w:t>
+              <w:t xml:space="preserve">59.0</w:t>
             </w:r>
           </w:p>
         </w:tc>
@@ -16382,7 +16382,7 @@
                 <w:sz w:val="16"/>
                 <w:szCs w:val="16"/>
               </w:rPr>
-              <w:t xml:space="preserve">57.2</w:t>
+              <w:t xml:space="preserve">57.1</w:t>
             </w:r>
           </w:p>
         </w:tc>
@@ -16594,7 +16594,7 @@
                 <w:sz w:val="16"/>
                 <w:szCs w:val="16"/>
               </w:rPr>
-              <w:t xml:space="preserve">57.6</w:t>
+              <w:t xml:space="preserve">57.7</w:t>
             </w:r>
           </w:p>
         </w:tc>
@@ -16628,7 +16628,7 @@
                 <w:sz w:val="16"/>
                 <w:szCs w:val="16"/>
               </w:rPr>
-              <w:t xml:space="preserve">56.1–59.0</w:t>
+              <w:t xml:space="preserve">56.3–59.1</w:t>
             </w:r>
           </w:p>
         </w:tc>
@@ -16696,7 +16696,7 @@
                 <w:sz w:val="16"/>
                 <w:szCs w:val="16"/>
               </w:rPr>
-              <w:t xml:space="preserve">57.7</w:t>
+              <w:t xml:space="preserve">57.9</w:t>
             </w:r>
           </w:p>
         </w:tc>
@@ -16908,7 +16908,7 @@
                 <w:sz w:val="16"/>
                 <w:szCs w:val="16"/>
               </w:rPr>
-              <w:t xml:space="preserve">57.6</w:t>
+              <w:t xml:space="preserve">57.4</w:t>
             </w:r>
           </w:p>
         </w:tc>
@@ -16943,7 +16943,7 @@
                 <w:sz w:val="16"/>
                 <w:szCs w:val="16"/>
               </w:rPr>
-              <w:t xml:space="preserve">56.0–59.1</w:t>
+              <w:t xml:space="preserve">55.9–59.0</w:t>
             </w:r>
           </w:p>
         </w:tc>
@@ -17013,7 +17013,7 @@
                 <w:sz w:val="16"/>
                 <w:szCs w:val="16"/>
               </w:rPr>
-              <w:t xml:space="preserve">59.5</w:t>
+              <w:t xml:space="preserve">59.4</w:t>
             </w:r>
           </w:p>
         </w:tc>
@@ -17259,7 +17259,7 @@
                 <w:sz w:val="16"/>
                 <w:szCs w:val="16"/>
               </w:rPr>
-              <w:t xml:space="preserve">54.5–57.5</w:t>
+              <w:t xml:space="preserve">54.5–57.6</w:t>
             </w:r>
           </w:p>
         </w:tc>
@@ -17293,7 +17293,7 @@
                 <w:sz w:val="16"/>
                 <w:szCs w:val="16"/>
               </w:rPr>
-              <w:t xml:space="preserve">5–10</w:t>
+              <w:t xml:space="preserve">5–9</w:t>
             </w:r>
           </w:p>
         </w:tc>
@@ -17327,7 +17327,7 @@
                 <w:sz w:val="16"/>
                 <w:szCs w:val="16"/>
               </w:rPr>
-              <w:t xml:space="preserve">54.1</w:t>
+              <w:t xml:space="preserve">54.2</w:t>
             </w:r>
           </w:p>
         </w:tc>
@@ -17539,7 +17539,7 @@
                 <w:sz w:val="16"/>
                 <w:szCs w:val="16"/>
               </w:rPr>
-              <w:t xml:space="preserve">55.4</w:t>
+              <w:t xml:space="preserve">55.5</w:t>
             </w:r>
           </w:p>
         </w:tc>
@@ -17574,7 +17574,7 @@
                 <w:sz w:val="16"/>
                 <w:szCs w:val="16"/>
               </w:rPr>
-              <w:t xml:space="preserve">53.9–56.8</w:t>
+              <w:t xml:space="preserve">54.0–56.9</w:t>
             </w:r>
           </w:p>
         </w:tc>
@@ -17609,7 +17609,7 @@
                 <w:sz w:val="16"/>
                 <w:szCs w:val="16"/>
               </w:rPr>
-              <w:t xml:space="preserve">7–11</w:t>
+              <w:t xml:space="preserve">6–10</w:t>
             </w:r>
           </w:p>
         </w:tc>
@@ -17644,7 +17644,7 @@
                 <w:sz w:val="16"/>
                 <w:szCs w:val="16"/>
               </w:rPr>
-              <w:t xml:space="preserve">55.4</w:t>
+              <w:t xml:space="preserve">55.5</w:t>
             </w:r>
           </w:p>
         </w:tc>
@@ -17856,7 +17856,7 @@
                 <w:sz w:val="16"/>
                 <w:szCs w:val="16"/>
               </w:rPr>
-              <w:t xml:space="preserve">54.9</w:t>
+              <w:t xml:space="preserve">55.0</w:t>
             </w:r>
           </w:p>
         </w:tc>
@@ -17958,7 +17958,7 @@
                 <w:sz w:val="16"/>
                 <w:szCs w:val="16"/>
               </w:rPr>
-              <w:t xml:space="preserve">53.2</w:t>
+              <w:t xml:space="preserve">53.3</w:t>
             </w:r>
           </w:p>
         </w:tc>
@@ -18170,7 +18170,7 @@
                 <w:sz w:val="16"/>
                 <w:szCs w:val="16"/>
               </w:rPr>
-              <w:t xml:space="preserve">54.9</w:t>
+              <w:t xml:space="preserve">54.5</w:t>
             </w:r>
           </w:p>
         </w:tc>
@@ -18205,7 +18205,7 @@
                 <w:sz w:val="16"/>
                 <w:szCs w:val="16"/>
               </w:rPr>
-              <w:t xml:space="preserve">53.2–56.6</w:t>
+              <w:t xml:space="preserve">52.8–56.2</w:t>
             </w:r>
           </w:p>
         </w:tc>
@@ -18275,7 +18275,7 @@
                 <w:sz w:val="16"/>
                 <w:szCs w:val="16"/>
               </w:rPr>
-              <w:t xml:space="preserve">53.2</w:t>
+              <w:t xml:space="preserve">52.8</w:t>
             </w:r>
           </w:p>
         </w:tc>
@@ -18487,7 +18487,7 @@
                 <w:sz w:val="16"/>
                 <w:szCs w:val="16"/>
               </w:rPr>
-              <w:t xml:space="preserve">54.2</w:t>
+              <w:t xml:space="preserve">54.1</w:t>
             </w:r>
           </w:p>
         </w:tc>
@@ -18521,7 +18521,7 @@
                 <w:sz w:val="16"/>
                 <w:szCs w:val="16"/>
               </w:rPr>
-              <w:t xml:space="preserve">52.6–55.6</w:t>
+              <w:t xml:space="preserve">52.5–55.5</w:t>
             </w:r>
           </w:p>
         </w:tc>
@@ -18555,7 +18555,7 @@
                 <w:sz w:val="16"/>
                 <w:szCs w:val="16"/>
               </w:rPr>
-              <w:t xml:space="preserve">8–11</w:t>
+              <w:t xml:space="preserve">9–12</w:t>
             </w:r>
           </w:p>
         </w:tc>
@@ -18589,7 +18589,7 @@
                 <w:sz w:val="16"/>
                 <w:szCs w:val="16"/>
               </w:rPr>
-              <w:t xml:space="preserve">52.5</w:t>
+              <w:t xml:space="preserve">52.4</w:t>
             </w:r>
           </w:p>
         </w:tc>
@@ -18801,7 +18801,7 @@
                 <w:sz w:val="16"/>
                 <w:szCs w:val="16"/>
               </w:rPr>
-              <w:t xml:space="preserve">52.2</w:t>
+              <w:t xml:space="preserve">52.4</w:t>
             </w:r>
           </w:p>
         </w:tc>
@@ -18836,7 +18836,7 @@
                 <w:sz w:val="16"/>
                 <w:szCs w:val="16"/>
               </w:rPr>
-              <w:t xml:space="preserve">50.0–53.8</w:t>
+              <w:t xml:space="preserve">50.2–53.9</w:t>
             </w:r>
           </w:p>
         </w:tc>
@@ -18906,7 +18906,7 @@
                 <w:sz w:val="16"/>
                 <w:szCs w:val="16"/>
               </w:rPr>
-              <w:t xml:space="preserve">52.5</w:t>
+              <w:t xml:space="preserve">52.7</w:t>
             </w:r>
           </w:p>
         </w:tc>
@@ -19118,7 +19118,7 @@
                 <w:sz w:val="16"/>
                 <w:szCs w:val="16"/>
               </w:rPr>
-              <w:t xml:space="preserve">49.0</w:t>
+              <w:t xml:space="preserve">48.9</w:t>
             </w:r>
           </w:p>
         </w:tc>
@@ -19152,7 +19152,7 @@
                 <w:sz w:val="16"/>
                 <w:szCs w:val="16"/>
               </w:rPr>
-              <w:t xml:space="preserve">47.2–50.7</w:t>
+              <w:t xml:space="preserve">47.1–50.7</w:t>
             </w:r>
           </w:p>
         </w:tc>
@@ -19220,7 +19220,7 @@
                 <w:sz w:val="16"/>
                 <w:szCs w:val="16"/>
               </w:rPr>
-              <w:t xml:space="preserve">47.6</w:t>
+              <w:t xml:space="preserve">47.5</w:t>
             </w:r>
           </w:p>
         </w:tc>
@@ -19432,7 +19432,7 @@
                 <w:sz w:val="16"/>
                 <w:szCs w:val="16"/>
               </w:rPr>
-              <w:t xml:space="preserve">48.7</w:t>
+              <w:t xml:space="preserve">48.6</w:t>
             </w:r>
           </w:p>
         </w:tc>
@@ -19467,7 +19467,7 @@
                 <w:sz w:val="16"/>
                 <w:szCs w:val="16"/>
               </w:rPr>
-              <w:t xml:space="preserve">46.8–50.2</w:t>
+              <w:t xml:space="preserve">46.7–50.1</w:t>
             </w:r>
           </w:p>
         </w:tc>
@@ -19537,7 +19537,7 @@
                 <w:sz w:val="16"/>
                 <w:szCs w:val="16"/>
               </w:rPr>
-              <w:t xml:space="preserve">47.7</w:t>
+              <w:t xml:space="preserve">47.6</w:t>
             </w:r>
           </w:p>
         </w:tc>
@@ -19749,7 +19749,7 @@
                 <w:sz w:val="16"/>
                 <w:szCs w:val="16"/>
               </w:rPr>
-              <w:t xml:space="preserve">46.4</w:t>
+              <w:t xml:space="preserve">46.3</w:t>
             </w:r>
           </w:p>
         </w:tc>
@@ -19783,7 +19783,7 @@
                 <w:sz w:val="16"/>
                 <w:szCs w:val="16"/>
               </w:rPr>
-              <w:t xml:space="preserve">44.8–48.1</w:t>
+              <w:t xml:space="preserve">44.7–48.0</w:t>
             </w:r>
           </w:p>
         </w:tc>
@@ -19851,7 +19851,7 @@
                 <w:sz w:val="16"/>
                 <w:szCs w:val="16"/>
               </w:rPr>
-              <w:t xml:space="preserve">46.1</w:t>
+              <w:t xml:space="preserve">46.0</w:t>
             </w:r>
           </w:p>
         </w:tc>
@@ -20028,7 +20028,7 @@
                 <w:sz w:val="16"/>
                 <w:szCs w:val="16"/>
               </w:rPr>
-              <w:t xml:space="preserve">Sweden</w:t>
+              <w:t xml:space="preserve">Taiwan</w:t>
             </w:r>
           </w:p>
         </w:tc>
@@ -20063,7 +20063,7 @@
                 <w:sz w:val="16"/>
                 <w:szCs w:val="16"/>
               </w:rPr>
-              <w:t xml:space="preserve">45.8</w:t>
+              <w:t xml:space="preserve">45.9</w:t>
             </w:r>
           </w:p>
         </w:tc>
@@ -20098,7 +20098,7 @@
                 <w:sz w:val="16"/>
                 <w:szCs w:val="16"/>
               </w:rPr>
-              <w:t xml:space="preserve">44.2–47.6</w:t>
+              <w:t xml:space="preserve">44.2–47.8</w:t>
             </w:r>
           </w:p>
         </w:tc>
@@ -20133,7 +20133,7 @@
                 <w:sz w:val="16"/>
                 <w:szCs w:val="16"/>
               </w:rPr>
-              <w:t xml:space="preserve">15–21</w:t>
+              <w:t xml:space="preserve">14–20</w:t>
             </w:r>
           </w:p>
         </w:tc>
@@ -20168,7 +20168,7 @@
                 <w:sz w:val="16"/>
                 <w:szCs w:val="16"/>
               </w:rPr>
-              <w:t xml:space="preserve">44.4</w:t>
+              <w:t xml:space="preserve">46.9</w:t>
             </w:r>
           </w:p>
         </w:tc>
@@ -20203,7 +20203,7 @@
                 <w:sz w:val="16"/>
                 <w:szCs w:val="16"/>
               </w:rPr>
-              <w:t xml:space="preserve">4.5</w:t>
+              <w:t xml:space="preserve">3.8</w:t>
             </w:r>
           </w:p>
         </w:tc>
@@ -20273,7 +20273,7 @@
                 <w:sz w:val="16"/>
                 <w:szCs w:val="16"/>
               </w:rPr>
-              <w:t xml:space="preserve">2%</w:t>
+              <w:t xml:space="preserve">11%</w:t>
             </w:r>
           </w:p>
         </w:tc>
@@ -20346,7 +20346,7 @@
                 <w:sz w:val="16"/>
                 <w:szCs w:val="16"/>
               </w:rPr>
-              <w:t xml:space="preserve">Taiwan</w:t>
+              <w:t xml:space="preserve">Sweden</w:t>
             </w:r>
           </w:p>
         </w:tc>
@@ -20414,7 +20414,7 @@
                 <w:sz w:val="16"/>
                 <w:szCs w:val="16"/>
               </w:rPr>
-              <w:t xml:space="preserve">44.1–47.7</w:t>
+              <w:t xml:space="preserve">44.2–47.6</w:t>
             </w:r>
           </w:p>
         </w:tc>
@@ -20448,7 +20448,7 @@
                 <w:sz w:val="16"/>
                 <w:szCs w:val="16"/>
               </w:rPr>
-              <w:t xml:space="preserve">15–20</w:t>
+              <w:t xml:space="preserve">15–21</w:t>
             </w:r>
           </w:p>
         </w:tc>
@@ -20482,7 +20482,7 @@
                 <w:sz w:val="16"/>
                 <w:szCs w:val="16"/>
               </w:rPr>
-              <w:t xml:space="preserve">46.9</w:t>
+              <w:t xml:space="preserve">44.4</w:t>
             </w:r>
           </w:p>
         </w:tc>
@@ -20516,7 +20516,7 @@
                 <w:sz w:val="16"/>
                 <w:szCs w:val="16"/>
               </w:rPr>
-              <w:t xml:space="preserve">3.8</w:t>
+              <w:t xml:space="preserve">4.5</w:t>
             </w:r>
           </w:p>
         </w:tc>
@@ -20584,7 +20584,7 @@
                 <w:sz w:val="16"/>
                 <w:szCs w:val="16"/>
               </w:rPr>
-              <w:t xml:space="preserve">11%</w:t>
+              <w:t xml:space="preserve">2%</w:t>
             </w:r>
           </w:p>
         </w:tc>
@@ -20694,7 +20694,7 @@
                 <w:sz w:val="16"/>
                 <w:szCs w:val="16"/>
               </w:rPr>
-              <w:t xml:space="preserve">45.5</w:t>
+              <w:t xml:space="preserve">45.4</w:t>
             </w:r>
           </w:p>
         </w:tc>
@@ -21011,7 +21011,7 @@
                 <w:sz w:val="16"/>
                 <w:szCs w:val="16"/>
               </w:rPr>
-              <w:t xml:space="preserve">45.3</w:t>
+              <w:t xml:space="preserve">45.2</w:t>
             </w:r>
           </w:p>
         </w:tc>
@@ -21360,7 +21360,7 @@
                 <w:sz w:val="16"/>
                 <w:szCs w:val="16"/>
               </w:rPr>
-              <w:t xml:space="preserve">43.1–46.7</w:t>
+              <w:t xml:space="preserve">43.1–46.8</w:t>
             </w:r>
           </w:p>
         </w:tc>
@@ -21956,7 +21956,7 @@
                 <w:sz w:val="16"/>
                 <w:szCs w:val="16"/>
               </w:rPr>
-              <w:t xml:space="preserve">41.6</w:t>
+              <w:t xml:space="preserve">41.7</w:t>
             </w:r>
           </w:p>
         </w:tc>
@@ -21991,7 +21991,7 @@
                 <w:sz w:val="16"/>
                 <w:szCs w:val="16"/>
               </w:rPr>
-              <w:t xml:space="preserve">39.6–43.7</w:t>
+              <w:t xml:space="preserve">39.6–43.8</w:t>
             </w:r>
           </w:p>
         </w:tc>
@@ -22273,7 +22273,7 @@
                 <w:sz w:val="16"/>
                 <w:szCs w:val="16"/>
               </w:rPr>
-              <w:t xml:space="preserve">41.1</w:t>
+              <w:t xml:space="preserve">41.3</w:t>
             </w:r>
           </w:p>
         </w:tc>
@@ -22307,7 +22307,7 @@
                 <w:sz w:val="16"/>
                 <w:szCs w:val="16"/>
               </w:rPr>
-              <w:t xml:space="preserve">39.6–43.1</w:t>
+              <w:t xml:space="preserve">39.7–43.2</w:t>
             </w:r>
           </w:p>
         </w:tc>
@@ -22375,7 +22375,7 @@
                 <w:sz w:val="16"/>
                 <w:szCs w:val="16"/>
               </w:rPr>
-              <w:t xml:space="preserve">39.3</w:t>
+              <w:t xml:space="preserve">39.5</w:t>
             </w:r>
           </w:p>
         </w:tc>
@@ -22587,7 +22587,7 @@
                 <w:sz w:val="16"/>
                 <w:szCs w:val="16"/>
               </w:rPr>
-              <w:t xml:space="preserve">39.5</w:t>
+              <w:t xml:space="preserve">39.4</w:t>
             </w:r>
           </w:p>
         </w:tc>
@@ -22622,7 +22622,7 @@
                 <w:sz w:val="16"/>
                 <w:szCs w:val="16"/>
               </w:rPr>
-              <w:t xml:space="preserve">38.1–41.6</w:t>
+              <w:t xml:space="preserve">38.0–41.5</w:t>
             </w:r>
           </w:p>
         </w:tc>
@@ -22657,7 +22657,7 @@
                 <w:sz w:val="16"/>
                 <w:szCs w:val="16"/>
               </w:rPr>
-              <w:t xml:space="preserve">22–26</w:t>
+              <w:t xml:space="preserve">23–26</w:t>
             </w:r>
           </w:p>
         </w:tc>
@@ -22692,7 +22692,7 @@
                 <w:sz w:val="16"/>
                 <w:szCs w:val="16"/>
               </w:rPr>
-              <w:t xml:space="preserve">39.7</w:t>
+              <w:t xml:space="preserve">39.6</w:t>
             </w:r>
           </w:p>
         </w:tc>
@@ -22904,7 +22904,7 @@
                 <w:sz w:val="16"/>
                 <w:szCs w:val="16"/>
               </w:rPr>
-              <w:t xml:space="preserve">39.2</w:t>
+              <w:t xml:space="preserve">39.1</w:t>
             </w:r>
           </w:p>
         </w:tc>
@@ -22938,7 +22938,7 @@
                 <w:sz w:val="16"/>
                 <w:szCs w:val="16"/>
               </w:rPr>
-              <w:t xml:space="preserve">37.5–41.3</w:t>
+              <w:t xml:space="preserve">37.4–41.2</w:t>
             </w:r>
           </w:p>
         </w:tc>
@@ -23006,7 +23006,7 @@
                 <w:sz w:val="16"/>
                 <w:szCs w:val="16"/>
               </w:rPr>
-              <w:t xml:space="preserve">41.0</w:t>
+              <w:t xml:space="preserve">40.9</w:t>
             </w:r>
           </w:p>
         </w:tc>
@@ -23218,7 +23218,7 @@
                 <w:sz w:val="16"/>
                 <w:szCs w:val="16"/>
               </w:rPr>
-              <w:t xml:space="preserve">38.0</w:t>
+              <w:t xml:space="preserve">37.9</w:t>
             </w:r>
           </w:p>
         </w:tc>
@@ -23253,7 +23253,7 @@
                 <w:sz w:val="16"/>
                 <w:szCs w:val="16"/>
               </w:rPr>
-              <w:t xml:space="preserve">36.6–39.8</w:t>
+              <w:t xml:space="preserve">36.5–39.7</w:t>
             </w:r>
           </w:p>
         </w:tc>
@@ -23323,7 +23323,7 @@
                 <w:sz w:val="16"/>
                 <w:szCs w:val="16"/>
               </w:rPr>
-              <w:t xml:space="preserve">37.8</w:t>
+              <w:t xml:space="preserve">37.7</w:t>
             </w:r>
           </w:p>
         </w:tc>
@@ -23501,7 +23501,7 @@
                 <w:sz w:val="16"/>
                 <w:szCs w:val="16"/>
               </w:rPr>
-              <w:t xml:space="preserve">Viet Nam</w:t>
+              <w:t xml:space="preserve">North Korea</w:t>
             </w:r>
           </w:p>
         </w:tc>
@@ -23569,7 +23569,7 @@
                 <w:sz w:val="16"/>
                 <w:szCs w:val="16"/>
               </w:rPr>
-              <w:t xml:space="preserve">35.5–39.1</w:t>
+              <w:t xml:space="preserve">35.4–39.4</w:t>
             </w:r>
           </w:p>
         </w:tc>
@@ -23637,7 +23637,7 @@
                 <w:sz w:val="16"/>
                 <w:szCs w:val="16"/>
               </w:rPr>
-              <w:t xml:space="preserve">39.2</w:t>
+              <w:t xml:space="preserve">37.2</w:t>
             </w:r>
           </w:p>
         </w:tc>
@@ -23671,7 +23671,7 @@
                 <w:sz w:val="16"/>
                 <w:szCs w:val="16"/>
               </w:rPr>
-              <w:t xml:space="preserve">4.0</w:t>
+              <w:t xml:space="preserve">3.5</w:t>
             </w:r>
           </w:p>
         </w:tc>
@@ -23705,7 +23705,7 @@
                 <w:sz w:val="16"/>
                 <w:szCs w:val="16"/>
               </w:rPr>
-              <w:t xml:space="preserve">No nuclear</w:t>
+              <w:t xml:space="preserve">Nuclear, limited</w:t>
             </w:r>
           </w:p>
         </w:tc>
@@ -23739,7 +23739,7 @@
                 <w:sz w:val="16"/>
                 <w:szCs w:val="16"/>
               </w:rPr>
-              <w:t xml:space="preserve">1%</w:t>
+              <w:t xml:space="preserve">15%</w:t>
             </w:r>
           </w:p>
         </w:tc>
@@ -23814,7 +23814,7 @@
                 <w:sz w:val="16"/>
                 <w:szCs w:val="16"/>
               </w:rPr>
-              <w:t xml:space="preserve">North Korea</w:t>
+              <w:t xml:space="preserve">Viet Nam</w:t>
             </w:r>
           </w:p>
         </w:tc>
@@ -23884,7 +23884,7 @@
                 <w:sz w:val="16"/>
                 <w:szCs w:val="16"/>
               </w:rPr>
-              <w:t xml:space="preserve">35.3–39.4</w:t>
+              <w:t xml:space="preserve">35.4–39.0</w:t>
             </w:r>
           </w:p>
         </w:tc>
@@ -23954,7 +23954,7 @@
                 <w:sz w:val="16"/>
                 <w:szCs w:val="16"/>
               </w:rPr>
-              <w:t xml:space="preserve">37.1</w:t>
+              <w:t xml:space="preserve">39.1</w:t>
             </w:r>
           </w:p>
         </w:tc>
@@ -23989,7 +23989,7 @@
                 <w:sz w:val="16"/>
                 <w:szCs w:val="16"/>
               </w:rPr>
-              <w:t xml:space="preserve">3.5</w:t>
+              <w:t xml:space="preserve">4.0</w:t>
             </w:r>
           </w:p>
         </w:tc>
@@ -24024,7 +24024,7 @@
                 <w:sz w:val="16"/>
                 <w:szCs w:val="16"/>
               </w:rPr>
-              <w:t xml:space="preserve">Nuclear, limited</w:t>
+              <w:t xml:space="preserve">No nuclear</w:t>
             </w:r>
           </w:p>
         </w:tc>
@@ -24059,7 +24059,7 @@
                 <w:sz w:val="16"/>
                 <w:szCs w:val="16"/>
               </w:rPr>
-              <w:t xml:space="preserve">15%</w:t>
+              <w:t xml:space="preserve">1%</w:t>
             </w:r>
           </w:p>
         </w:tc>
@@ -24166,7 +24166,7 @@
                 <w:sz w:val="16"/>
                 <w:szCs w:val="16"/>
               </w:rPr>
-              <w:t xml:space="preserve">35.6</w:t>
+              <w:t xml:space="preserve">35.5</w:t>
             </w:r>
           </w:p>
         </w:tc>
@@ -24200,7 +24200,7 @@
                 <w:sz w:val="16"/>
                 <w:szCs w:val="16"/>
               </w:rPr>
-              <w:t xml:space="preserve">33.9–38.1</w:t>
+              <w:t xml:space="preserve">33.8–38.0</w:t>
             </w:r>
           </w:p>
         </w:tc>
@@ -24268,7 +24268,7 @@
                 <w:sz w:val="16"/>
                 <w:szCs w:val="16"/>
               </w:rPr>
-              <w:t xml:space="preserve">35.6</w:t>
+              <w:t xml:space="preserve">35.5</w:t>
             </w:r>
           </w:p>
         </w:tc>
@@ -24550,7 +24550,7 @@
                 <w:sz w:val="16"/>
                 <w:szCs w:val="16"/>
               </w:rPr>
-              <w:t xml:space="preserve">30–31</w:t>
+              <w:t xml:space="preserve">29–31</w:t>
             </w:r>
           </w:p>
         </w:tc>
@@ -24797,7 +24797,7 @@
                 <w:sz w:val="16"/>
                 <w:szCs w:val="16"/>
               </w:rPr>
-              <w:t xml:space="preserve">31.0</w:t>
+              <w:t xml:space="preserve">30.9</w:t>
             </w:r>
           </w:p>
         </w:tc>
@@ -24831,7 +24831,7 @@
                 <w:sz w:val="16"/>
                 <w:szCs w:val="16"/>
               </w:rPr>
-              <w:t xml:space="preserve">29.6–33.6</w:t>
+              <w:t xml:space="preserve">29.5–33.4</w:t>
             </w:r>
           </w:p>
         </w:tc>
@@ -24899,7 +24899,7 @@
                 <w:sz w:val="16"/>
                 <w:szCs w:val="16"/>
               </w:rPr>
-              <w:t xml:space="preserve">30.1</w:t>
+              <w:t xml:space="preserve">30.0</w:t>
             </w:r>
           </w:p>
         </w:tc>
@@ -25216,7 +25216,7 @@
                 <w:sz w:val="16"/>
                 <w:szCs w:val="16"/>
               </w:rPr>
-              <w:t xml:space="preserve">29.2</w:t>
+              <w:t xml:space="preserve">29.3</w:t>
             </w:r>
           </w:p>
         </w:tc>
@@ -25428,7 +25428,7 @@
                 <w:sz w:val="16"/>
                 <w:szCs w:val="16"/>
               </w:rPr>
-              <w:t xml:space="preserve">23.6</w:t>
+              <w:t xml:space="preserve">23.8</w:t>
             </w:r>
           </w:p>
         </w:tc>
@@ -25462,7 +25462,7 @@
                 <w:sz w:val="16"/>
                 <w:szCs w:val="16"/>
               </w:rPr>
-              <w:t xml:space="preserve">22.2–26.5</w:t>
+              <w:t xml:space="preserve">22.4–26.6</w:t>
             </w:r>
           </w:p>
         </w:tc>
@@ -25530,7 +25530,7 @@
                 <w:sz w:val="16"/>
                 <w:szCs w:val="16"/>
               </w:rPr>
-              <w:t xml:space="preserve">23.6</w:t>
+              <w:t xml:space="preserve">23.7</w:t>
             </w:r>
           </w:p>
         </w:tc>
@@ -25742,7 +25742,7 @@
                 <w:sz w:val="16"/>
                 <w:szCs w:val="16"/>
               </w:rPr>
-              <w:t xml:space="preserve">23.1</w:t>
+              <w:t xml:space="preserve">22.5</w:t>
             </w:r>
           </w:p>
         </w:tc>
@@ -25777,7 +25777,7 @@
                 <w:sz w:val="16"/>
                 <w:szCs w:val="16"/>
               </w:rPr>
-              <w:t xml:space="preserve">22.1–26.0</w:t>
+              <w:t xml:space="preserve">21.5–25.4</w:t>
             </w:r>
           </w:p>
         </w:tc>
@@ -25847,7 +25847,7 @@
                 <w:sz w:val="16"/>
                 <w:szCs w:val="16"/>
               </w:rPr>
-              <w:t xml:space="preserve">24.1</w:t>
+              <w:t xml:space="preserve">23.4</w:t>
             </w:r>
           </w:p>
         </w:tc>
@@ -26059,7 +26059,7 @@
                 <w:sz w:val="16"/>
                 <w:szCs w:val="16"/>
               </w:rPr>
-              <w:t xml:space="preserve">22.5</w:t>
+              <w:t xml:space="preserve">22.4</w:t>
             </w:r>
           </w:p>
         </w:tc>
@@ -26093,7 +26093,7 @@
                 <w:sz w:val="16"/>
                 <w:szCs w:val="16"/>
               </w:rPr>
-              <w:t xml:space="preserve">21.4–25.8</w:t>
+              <w:t xml:space="preserve">21.3–25.7</w:t>
             </w:r>
           </w:p>
         </w:tc>
@@ -26161,7 +26161,7 @@
                 <w:sz w:val="16"/>
                 <w:szCs w:val="16"/>
               </w:rPr>
-              <w:t xml:space="preserve">23.2</w:t>
+              <w:t xml:space="preserve">23.1</w:t>
             </w:r>
           </w:p>
         </w:tc>
@@ -26373,7 +26373,7 @@
                 <w:sz w:val="16"/>
                 <w:szCs w:val="16"/>
               </w:rPr>
-              <w:t xml:space="preserve">17.9</w:t>
+              <w:t xml:space="preserve">18.1</w:t>
             </w:r>
           </w:p>
         </w:tc>
@@ -26408,7 +26408,7 @@
                 <w:sz w:val="16"/>
                 <w:szCs w:val="16"/>
               </w:rPr>
-              <w:t xml:space="preserve">17.2–21.3</w:t>
+              <w:t xml:space="preserve">17.4–21.5</w:t>
             </w:r>
           </w:p>
         </w:tc>
@@ -26478,7 +26478,7 @@
                 <w:sz w:val="16"/>
                 <w:szCs w:val="16"/>
               </w:rPr>
-              <w:t xml:space="preserve">18.0</w:t>
+              <w:t xml:space="preserve">18.2</w:t>
             </w:r>
           </w:p>
         </w:tc>
@@ -26690,7 +26690,7 @@
                 <w:sz w:val="16"/>
                 <w:szCs w:val="16"/>
               </w:rPr>
-              <w:t xml:space="preserve">17.4</w:t>
+              <w:t xml:space="preserve">17.5</w:t>
             </w:r>
           </w:p>
         </w:tc>
@@ -26724,7 +26724,7 @@
                 <w:sz w:val="16"/>
                 <w:szCs w:val="16"/>
               </w:rPr>
-              <w:t xml:space="preserve">16.8–20.9</w:t>
+              <w:t xml:space="preserve">17.0–21.0</w:t>
             </w:r>
           </w:p>
         </w:tc>
@@ -26792,7 +26792,7 @@
                 <w:sz w:val="16"/>
                 <w:szCs w:val="16"/>
               </w:rPr>
-              <w:t xml:space="preserve">17.5</w:t>
+              <w:t xml:space="preserve">17.7</w:t>
             </w:r>
           </w:p>
         </w:tc>
@@ -27074,7 +27074,7 @@
                 <w:sz w:val="16"/>
                 <w:szCs w:val="16"/>
               </w:rPr>
-              <w:t xml:space="preserve">36–39</w:t>
+              <w:t xml:space="preserve">37–38</w:t>
             </w:r>
           </w:p>
         </w:tc>
@@ -27355,7 +27355,7 @@
                 <w:sz w:val="16"/>
                 <w:szCs w:val="16"/>
               </w:rPr>
-              <w:t xml:space="preserve">12.9–17.2</w:t>
+              <w:t xml:space="preserve">13.0–17.1</w:t>
             </w:r>
           </w:p>
         </w:tc>
@@ -27389,7 +27389,7 @@
                 <w:sz w:val="16"/>
                 <w:szCs w:val="16"/>
               </w:rPr>
-              <w:t xml:space="preserve">38–40</w:t>
+              <w:t xml:space="preserve">39–40</w:t>
             </w:r>
           </w:p>
         </w:tc>
@@ -27423,7 +27423,7 @@
                 <w:sz w:val="16"/>
                 <w:szCs w:val="16"/>
               </w:rPr>
-              <w:t xml:space="preserve">14.1</w:t>
+              <w:t xml:space="preserve">14.2</w:t>
             </w:r>
           </w:p>
         </w:tc>
@@ -27525,7 +27525,7 @@
                 <w:sz w:val="16"/>
                 <w:szCs w:val="16"/>
               </w:rPr>
-              <w:t xml:space="preserve">13%</w:t>
+              <w:t xml:space="preserve">11%</w:t>
             </w:r>
           </w:p>
         </w:tc>
@@ -27635,7 +27635,7 @@
                 <w:sz w:val="16"/>
                 <w:szCs w:val="16"/>
               </w:rPr>
-              <w:t xml:space="preserve">11.9</w:t>
+              <w:t xml:space="preserve">12.0</w:t>
             </w:r>
           </w:p>
         </w:tc>
@@ -27670,7 +27670,7 @@
                 <w:sz w:val="16"/>
                 <w:szCs w:val="16"/>
               </w:rPr>
-              <w:t xml:space="preserve">11.9–16.1</w:t>
+              <w:t xml:space="preserve">11.9–16.2</w:t>
             </w:r>
           </w:p>
         </w:tc>
@@ -27740,7 +27740,7 @@
                 <w:sz w:val="16"/>
                 <w:szCs w:val="16"/>
               </w:rPr>
-              <w:t xml:space="preserve">12.7</w:t>
+              <w:t xml:space="preserve">12.8</w:t>
             </w:r>
           </w:p>
         </w:tc>
@@ -27862,7 +27862,7 @@
         <w:jc w:val="both"/>
       </w:pPr>
       <w:r>
-        <w:t xml:space="preserve">The top three are stable: the United States and China share places 1–2, Russia — third. Then France, South Korea, India, the United Kingdom, Japan, Germany and Türkiye lie within 4.2 points, and in 90% of runs their places are shuffled within the range 4–11. Imputed values are noticeable only for countries with poor open data: North Korea, Rwanda, Eritrea, Afghanistan, Taiwan.</w:t>
+        <w:t xml:space="preserve">The top three are stable: the United States and China share places 1–2, Russia — third. Then France, South Korea, India, the United Kingdom, Japan, Germany and Türkiye lie within 4.5 points, and in 90% of runs their places are shuffled within the range 4–11. Imputed values are noticeable only for countries with poor open data: North Korea, Rwanda, Afghanistan, Taiwan, Eritrea.</w:t>
       </w:r>
     </w:p>
     <w:p>
@@ -28347,7 +28347,7 @@
                 <w:sz w:val="18"/>
                 <w:szCs w:val="18"/>
               </w:rPr>
-              <w:t xml:space="preserve">59.1</w:t>
+              <w:t xml:space="preserve">59.0</w:t>
             </w:r>
           </w:p>
         </w:tc>
@@ -28382,7 +28382,7 @@
                 <w:sz w:val="18"/>
                 <w:szCs w:val="18"/>
               </w:rPr>
-              <w:t xml:space="preserve">−7.8</w:t>
+              <w:t xml:space="preserve">−7.9</w:t>
             </w:r>
           </w:p>
         </w:tc>
@@ -28489,7 +28489,7 @@
                 <w:sz w:val="18"/>
                 <w:szCs w:val="18"/>
               </w:rPr>
-              <w:t xml:space="preserve">52.2</w:t>
+              <w:t xml:space="preserve">52.4</w:t>
             </w:r>
           </w:p>
         </w:tc>
@@ -28523,7 +28523,7 @@
                 <w:sz w:val="18"/>
                 <w:szCs w:val="18"/>
               </w:rPr>
-              <w:t xml:space="preserve">−12.2</w:t>
+              <w:t xml:space="preserve">−12.1</w:t>
             </w:r>
           </w:p>
         </w:tc>
@@ -28633,7 +28633,7 @@
                 <w:sz w:val="18"/>
                 <w:szCs w:val="18"/>
               </w:rPr>
-              <w:t xml:space="preserve">70.5</w:t>
+              <w:t xml:space="preserve">70.4</w:t>
             </w:r>
           </w:p>
         </w:tc>
@@ -28919,7 +28919,7 @@
                 <w:sz w:val="18"/>
                 <w:szCs w:val="18"/>
               </w:rPr>
-              <w:t xml:space="preserve">54.9</w:t>
+              <w:t xml:space="preserve">55.0</w:t>
             </w:r>
           </w:p>
         </w:tc>
@@ -28954,7 +28954,7 @@
                 <w:sz w:val="18"/>
                 <w:szCs w:val="18"/>
               </w:rPr>
-              <w:t xml:space="preserve">−4.0</w:t>
+              <w:t xml:space="preserve">−3.9</w:t>
             </w:r>
           </w:p>
         </w:tc>
@@ -29061,7 +29061,7 @@
                 <w:sz w:val="18"/>
                 <w:szCs w:val="18"/>
               </w:rPr>
-              <w:t xml:space="preserve">45.3</w:t>
+              <w:t xml:space="preserve">45.2</w:t>
             </w:r>
           </w:p>
         </w:tc>
@@ -29240,7 +29240,7 @@
                 <w:sz w:val="18"/>
                 <w:szCs w:val="18"/>
               </w:rPr>
-              <w:t xml:space="preserve">+13.2</w:t>
+              <w:t xml:space="preserve">+13.3</w:t>
             </w:r>
           </w:p>
         </w:tc>
@@ -30607,7 +30607,7 @@
                 <w:sz w:val="16"/>
                 <w:szCs w:val="16"/>
               </w:rPr>
-              <w:t xml:space="preserve">offensive success (61% / 1% / 38%) — correct</w:t>
+              <w:t xml:space="preserve">offensive success (59% / 2% / 40%) — correct</w:t>
             </w:r>
           </w:p>
         </w:tc>
@@ -30926,7 +30926,7 @@
                 <w:sz w:val="16"/>
                 <w:szCs w:val="16"/>
               </w:rPr>
-              <w:t xml:space="preserve">1.18</w:t>
+              <w:t xml:space="preserve">1.16</w:t>
             </w:r>
           </w:p>
         </w:tc>
@@ -31139,7 +31139,7 @@
                 <w:sz w:val="16"/>
                 <w:szCs w:val="16"/>
               </w:rPr>
-              <w:t xml:space="preserve">2.16</w:t>
+              <w:t xml:space="preserve">2.13</w:t>
             </w:r>
           </w:p>
         </w:tc>
@@ -31317,7 +31317,7 @@
         <w:t xml:space="preserve">Main lesson of the validation. </w:t>
       </w:r>
       <w:r>
-        <w:t xml:space="preserve">In the pilot the model sees Russia as 2.5 times stronger than Ukraine in theatre and predicts a successful offensive, whereas a positional war is under way. The expert assessment, which allows for training, experience and motivation, gives 1.68 : 1 and a correct forecast. For Karabakh 2020 the pilot, on 2025 data, sees a sufficient advantage (2.16 where 0.89 is required) but too small for a rapid victory: the combat model gives protracted fighting a probability of 0%, while the war ended in 44 days — the decisive role of UAVs and training is not visible in open data. Conclusion: shares of modern equipment moved the balance in the right direction, but without indicators of training and motivation predictive power is insufficient.</w:t>
+        <w:t xml:space="preserve">In the pilot the model sees Russia as 2.5 times stronger than Ukraine in theatre and predicts a successful offensive, whereas a positional war is under way. The expert assessment, which allows for training, experience and motivation, gives 1.68 : 1 and a correct forecast. For Karabakh 2020 the pilot, on 2025 data, sees a sufficient advantage (2.13 where 0.89 is required) but too small for a rapid victory: the combat model gives protracted fighting a probability of 0%, while the war ended in 44 days — the decisive role of UAVs and training is not visible in open data. Conclusion: shares of modern equipment moved the balance in the right direction, but without indicators of training and motivation predictive power is insufficient.</w:t>
       </w:r>
     </w:p>
     <w:p>
@@ -31879,7 +31879,7 @@
                 <w:sz w:val="18"/>
                 <w:szCs w:val="18"/>
               </w:rPr>
-              <w:t xml:space="preserve">83.9%</w:t>
+              <w:t xml:space="preserve">84.0%</w:t>
             </w:r>
           </w:p>
         </w:tc>
@@ -32615,7 +32615,7 @@
         <w:jc w:val="both"/>
       </w:pPr>
       <w:r>
-        <w:t xml:space="preserve">The AI assessment for non-measurable indicators (training, command, network-centric warfare, EW, production) moved Ukraine's index closer to the expert one (35.8 → 45.3 against 47.3 for the experts) and reduced Russia's advantage to 2.52 : 1, but it is still above the required 1.70 : 1, and the model still predicts a successful offensive. At the same time Pakistan and Iran rose: the “India versus Pakistan” case became incorrect (0.92 : 1), and Iran (44.7) was rated higher than by the experts (31.5). The judgement of a single model improves agreement with the experts on average (Spearman 0.76 → 0.81) but does not confer predictive power; the latter requires a real panel with independent estimates and calibration (document 7) or closed data.</w:t>
+        <w:t xml:space="preserve">The AI assessment for non-measurable indicators (training, command, network-centric warfare, EW, production) moved Ukraine's index closer to the expert one (35.7 → 45.2 against 47.3 for the experts) and reduced Russia's advantage to 2.52 : 1, but it is still above the required 1.70 : 1, and the model still predicts a successful offensive. At the same time Pakistan and Iran rose: the “India versus Pakistan” case became incorrect (0.92 : 1), and Iran (44.7) was rated higher than by the experts (31.5). The judgement of a single model improves agreement with the experts on average (Spearman 0.76 → 0.81) but does not confer predictive power; the latter requires a real panel with independent estimates and calibration (document 7) or closed data.</w:t>
       </w:r>
     </w:p>
     <w:p>
@@ -32861,7 +32861,7 @@
                 <w:sz w:val="18"/>
                 <w:szCs w:val="18"/>
               </w:rPr>
-              <w:t xml:space="preserve">data</w:t>
+              <w:t xml:space="preserve">structure</w:t>
             </w:r>
           </w:p>
         </w:tc>
@@ -32929,7 +32929,7 @@
                 <w:sz w:val="18"/>
                 <w:szCs w:val="18"/>
               </w:rPr>
-              <w:t xml:space="preserve">0.56</w:t>
+              <w:t xml:space="preserve">—</w:t>
             </w:r>
           </w:p>
         </w:tc>
@@ -32969,7 +32969,7 @@
                 <w:sz w:val="18"/>
                 <w:szCs w:val="18"/>
               </w:rPr>
-              <w:t xml:space="preserve">structure</w:t>
+              <w:t xml:space="preserve">data</w:t>
             </w:r>
           </w:p>
         </w:tc>
@@ -33004,7 +33004,7 @@
                 <w:sz w:val="18"/>
                 <w:szCs w:val="18"/>
               </w:rPr>
-              <w:t xml:space="preserve">0.36</w:t>
+              <w:t xml:space="preserve">0.35</w:t>
             </w:r>
           </w:p>
         </w:tc>
@@ -33039,7 +33039,7 @@
                 <w:sz w:val="18"/>
                 <w:szCs w:val="18"/>
               </w:rPr>
-              <w:t xml:space="preserve">—</w:t>
+              <w:t xml:space="preserve">0.55</w:t>
             </w:r>
           </w:p>
         </w:tc>
@@ -50210,7 +50210,7 @@
         <w:t xml:space="preserve">Expert indicators without an objective measurer</w:t>
       </w:r>
       <w:r>
-        <w:t xml:space="preserve"> (67, a template for 1,268 cells): training, serviceability, flying hours, quality of command, munitions production. They are to be filled — by an expert panel under the Delphi procedure with explicit uncertainty; without them the pilot does not pass validation on the war between Russia and Ukraine.</w:t>
+        <w:t xml:space="preserve"> (64, a template for 1,268 cells): training, serviceability, flying hours, quality of command, munitions production. They are to be filled — by an expert panel under the Delphi procedure with explicit uncertainty; without them the pilot does not pass validation on the war between Russia and Ukraine.</w:t>
       </w:r>
     </w:p>
     <w:p>

</xml_diff>

<commit_message>
Публикация прототипа из Flumos1/MLO@001b5b5cde2d086a14823f8076d626c8c08ea656
</commit_message>
<xml_diff>
--- a/docs/06_Pilot_40_countries_EN.docx
+++ b/docs/06_Pilot_40_countries_EN.docx
@@ -72,7 +72,7 @@
           <w:sz w:val="22"/>
           <w:szCs w:val="22"/>
         </w:rPr>
-        <w:t xml:space="preserve">MPI-LO methodology 0.1 (pilot, October 2026); data snapshot hash 9e84e3a6deffc44f</w:t>
+        <w:t xml:space="preserve">MPI-LO methodology 0.1 (pilot, October 2026); data snapshot hash 9ec24ff7be94a607</w:t>
       </w:r>
     </w:p>
     <w:p>
@@ -907,7 +907,7 @@
         <w:t xml:space="preserve">Data.</w:t>
       </w:r>
       <w:r>
-        <w:t xml:space="preserve"> Values were collected automatically for 84.0% of “country × indicator” cells (8,499 of 10,120): open statistics are 91% filled, the IISS block — 67%, OSINT indicators — 69%, expert ones — 99% (a template has been prepared for them).</w:t>
+        <w:t xml:space="preserve"> Values were collected automatically for 84.0% of “country × indicator” cells (8,497 of 10,120): open statistics are 91% filled, the IISS block — 67%, OSINT indicators — 69%, expert ones — 99% (a template has been prepared for them).</w:t>
       </w:r>
     </w:p>
     <w:p>
@@ -4134,7 +4134,7 @@
                 <w:sz w:val="18"/>
                 <w:szCs w:val="18"/>
               </w:rPr>
-              <w:t xml:space="preserve">3111</w:t>
+              <w:t xml:space="preserve">3109</w:t>
             </w:r>
           </w:p>
         </w:tc>
@@ -4402,7 +4402,7 @@
         <w:jc w:val="both"/>
       </w:pPr>
       <w:r>
-        <w:t xml:space="preserve">Of the 253 indicators, 22 have no data for any country: these are expert scores, production and operational OSINT indicators (shell and drone output, flying hours, days at sea) and part of the IISS indicators that are absent from open tables (special operations forces, SAM battalions, vertical launch system cells, average age of fleets). A manual entry template for 1,268 cells has been created for them. Quality indicators (role Q) are filled to 88%.</w:t>
+        <w:t xml:space="preserve">Of the 253 indicators, 22 have no data for any country: these are expert scores, production and operational OSINT indicators (shell and drone output, flying hours, days at sea) and part of the IISS indicators that are absent from open tables (special operations forces, SAM battalions, vertical launch system cells, average age of fleets). A manual entry template for 1,270 cells has been created for them. Quality indicators (role Q) are filled to 88%.</w:t>
       </w:r>
     </w:p>
     <w:p>
@@ -27635,7 +27635,7 @@
                 <w:sz w:val="16"/>
                 <w:szCs w:val="16"/>
               </w:rPr>
-              <w:t xml:space="preserve">12.0</w:t>
+              <w:t xml:space="preserve">11.5</w:t>
             </w:r>
           </w:p>
         </w:tc>
@@ -27670,7 +27670,7 @@
                 <w:sz w:val="16"/>
                 <w:szCs w:val="16"/>
               </w:rPr>
-              <w:t xml:space="preserve">11.9–16.2</w:t>
+              <w:t xml:space="preserve">11.4–15.5</w:t>
             </w:r>
           </w:p>
         </w:tc>
@@ -27740,7 +27740,7 @@
                 <w:sz w:val="16"/>
                 <w:szCs w:val="16"/>
               </w:rPr>
-              <w:t xml:space="preserve">12.8</w:t>
+              <w:t xml:space="preserve">12.2</w:t>
             </w:r>
           </w:p>
         </w:tc>
@@ -50210,7 +50210,7 @@
         <w:t xml:space="preserve">Expert indicators without an objective measurer</w:t>
       </w:r>
       <w:r>
-        <w:t xml:space="preserve"> (64, a template for 1,268 cells): training, serviceability, flying hours, quality of command, munitions production. They are to be filled — by an expert panel under the Delphi procedure with explicit uncertainty; without them the pilot does not pass validation on the war between Russia and Ukraine.</w:t>
+        <w:t xml:space="preserve"> (64, a template for 1,270 cells): training, serviceability, flying hours, quality of command, munitions production. They are to be filled — by an expert panel under the Delphi procedure with explicit uncertainty; without them the pilot does not pass validation on the war between Russia and Ukraine.</w:t>
       </w:r>
     </w:p>
     <w:p>

</xml_diff>

<commit_message>
Публикация прототипа из Flumos1/MLO@c23700e5893f70c208df5d4332a62e3fd3020b81
</commit_message>
<xml_diff>
--- a/docs/06_Pilot_40_countries_EN.docx
+++ b/docs/06_Pilot_40_countries_EN.docx
@@ -72,7 +72,7 @@
           <w:sz w:val="22"/>
           <w:szCs w:val="22"/>
         </w:rPr>
-        <w:t xml:space="preserve">MPI-LO methodology 0.1 (pilot, October 2026); data snapshot hash 9ec24ff7be94a607</w:t>
+        <w:t xml:space="preserve">MPI-LO methodology 0.1 (pilot, October 2026); data snapshot hash 2d3bdc764b64aa6b</w:t>
       </w:r>
     </w:p>
     <w:p>
@@ -8967,7 +8967,7 @@
                 <w:sz w:val="16"/>
                 <w:szCs w:val="16"/>
               </w:rPr>
-              <w:t xml:space="preserve">95%</w:t>
+              <w:t xml:space="preserve">91%</w:t>
             </w:r>
           </w:p>
         </w:tc>
@@ -17259,7 +17259,7 @@
                 <w:sz w:val="16"/>
                 <w:szCs w:val="16"/>
               </w:rPr>
-              <w:t xml:space="preserve">54.5–57.6</w:t>
+              <w:t xml:space="preserve">54.6–57.6</w:t>
             </w:r>
           </w:p>
         </w:tc>
@@ -19749,7 +19749,7 @@
                 <w:sz w:val="16"/>
                 <w:szCs w:val="16"/>
               </w:rPr>
-              <w:t xml:space="preserve">46.3</w:t>
+              <w:t xml:space="preserve">46.0</w:t>
             </w:r>
           </w:p>
         </w:tc>
@@ -19783,7 +19783,7 @@
                 <w:sz w:val="16"/>
                 <w:szCs w:val="16"/>
               </w:rPr>
-              <w:t xml:space="preserve">44.7–48.0</w:t>
+              <w:t xml:space="preserve">44.4–47.7</w:t>
             </w:r>
           </w:p>
         </w:tc>
@@ -19817,7 +19817,7 @@
                 <w:sz w:val="16"/>
                 <w:szCs w:val="16"/>
               </w:rPr>
-              <w:t xml:space="preserve">14–19</w:t>
+              <w:t xml:space="preserve">15–20</w:t>
             </w:r>
           </w:p>
         </w:tc>
@@ -19851,7 +19851,7 @@
                 <w:sz w:val="16"/>
                 <w:szCs w:val="16"/>
               </w:rPr>
-              <w:t xml:space="preserve">46.0</w:t>
+              <w:t xml:space="preserve">45.6</w:t>
             </w:r>
           </w:p>
         </w:tc>
@@ -21395,7 +21395,7 @@
                 <w:sz w:val="16"/>
                 <w:szCs w:val="16"/>
               </w:rPr>
-              <w:t xml:space="preserve">16–21</w:t>
+              <w:t xml:space="preserve">15–21</w:t>
             </w:r>
           </w:p>
         </w:tc>
@@ -30715,7 +30715,7 @@
                 <w:sz w:val="16"/>
                 <w:szCs w:val="16"/>
               </w:rPr>
-              <w:t xml:space="preserve">0.92</w:t>
+              <w:t xml:space="preserve">0.94</w:t>
             </w:r>
           </w:p>
         </w:tc>
@@ -32615,7 +32615,7 @@
         <w:jc w:val="both"/>
       </w:pPr>
       <w:r>
-        <w:t xml:space="preserve">The AI assessment for non-measurable indicators (training, command, network-centric warfare, EW, production) moved Ukraine's index closer to the expert one (35.7 → 45.2 against 47.3 for the experts) and reduced Russia's advantage to 2.52 : 1, but it is still above the required 1.70 : 1, and the model still predicts a successful offensive. At the same time Pakistan and Iran rose: the “India versus Pakistan” case became incorrect (0.92 : 1), and Iran (44.7) was rated higher than by the experts (31.5). The judgement of a single model improves agreement with the experts on average (Spearman 0.76 → 0.81) but does not confer predictive power; the latter requires a real panel with independent estimates and calibration (document 7) or closed data.</w:t>
+        <w:t xml:space="preserve">The AI estimate of unmeasurable indicators (training, command, network-centricity, electronic warfare, production) brought Ukraine's index closer to the expert one (35.7 → 45.2 against 47.3 for the experts) and cut Russia's superiority to 2.52 : 1, but it is still above the required 1.70 : 1, and the model still predicts the success of an offensive. At the same time Pakistan and Iran rose: the case «India against Pakistan» became wrong (0.94 : 1), and Iran (44.7) is rated above the experts' figure (31.5). The judgement of a single model improves agreement with the experts on average (Spearman 0.76 → 0.81) but gives no predictive power. That needs a real panel with independent assessments and calibration (document 7) or closed data.</w:t>
       </w:r>
     </w:p>
     <w:p>

</xml_diff>